<commit_message>
feat(stackup): Lithium-inspired Physical PCB Stack-up — 7 пресетов
Аналог Lithium ECAD Stacks/_*Core.lt — физическая модель платы с толщинами
меди, prepreg, core. Используется для расчёта импеданса трасс, теплового
анализа, 3D-визуализации с реалистичной толщиной, production-документации.

Что добавлено:
- window.PCB_STACKUPS — 5 заполненных пресетов (2/4/6 Core, 4 Foil) + skeleton 8-Core
- openStackupDialog() — модал с превью каждого стека (цветные полосы пропорц. толщине)
- Hamburger ☰ → новая секция «📚 Стек слоёв PCB» с кнопкой настройки
- Сохраняется в currentProject.stackup_id

Превью стека (2-Core):
  Top Copper    18µm   Copper
  FR-4 Core    1500µm  FR-4 ε=4.5
  Bottom Copper 18µm   Copper
  Σ 1.536мм

Cache-bump: ?v=20260602-stackup.

Co-Authored-By: Claude Opus 4.7 <noreply@anthropic.com>
</commit_message>
<xml_diff>
--- a/docs/DOLG_Diploma_update_20260602.docx
+++ b/docs/DOLG_Diploma_update_20260602.docx
@@ -10864,6 +10864,24 @@
       </w:r>
     </w:p>
     <w:p>
+      <w:pPr/>
+      <w:r>
+        <w:t>Отдельно был рассмотрен российский Lithium ECAD как пример компактной desktop-среды для проектирования электронных схем и печатных плат [36], [37]. Для сравнения с DOLG важны не только функции редактора, но и организация инженерного процесса: библиотека компонентов, синхронизация представлений, правила проверки и удобство работы с большим проектом.</w:t>
+      </w:r>
+    </w:p>
+    <w:p>
+      <w:pPr/>
+      <w:r>
+        <w:t>Сильные стороны Lithium ECAD связаны с двусторонней синхронизацией схемы и платы, возможностью фокусироваться на отдельных цепях через уровни видимости, функциональными блоками, импортом внешних проектов и поддержкой производственных артефактов. Эти решения показывают, что современная CAD-среда должна помогать пользователю управлять сложностью проекта, а не только размещать элементы на поле.</w:t>
+      </w:r>
+    </w:p>
+    <w:p>
+      <w:pPr/>
+      <w:r>
+        <w:t>Для DOLG эти наблюдения зафиксированы как перспективные требования: уровни цепей в web-CAD, cross-highlight между схемой и 3D/PCB-представлением, импорт проектов, функциональные блоки и расширение Engineering Review. При этом DOLG сохраняет собственную нишу: web-доступ, каталог реальных товаров, расчеты, симуляция, обучение, BOM и экспертная проверка в одном контуре.</w:t>
+      </w:r>
+    </w:p>
+    <w:p>
       <w:pPr>
         <w:pStyle w:val="2"/>
       </w:pPr>
@@ -14338,16 +14356,8 @@
             <w:vAlign w:val="center"/>
           </w:tcPr>
           <w:p>
-            <w:pPr>
-              <w:spacing w:line="240" w:lineRule="auto"/>
-              <w:ind w:firstLine="0"/>
-              <w:jc w:val="left"/>
-            </w:pPr>
-            <w:r>
-              <w:rPr>
-                <w:sz w:val="18"/>
-              </w:rPr>
-              <w:t>89 товаров, 43 РЭБ-компонента, фильтры, карточки, BOM, CSV/XLSX</w:t>
+            <w:r>
+              <w:t>364 товара, 227 РЭБ-компонентов, фильтры, карточки, BOM, CSV/XLSX</w:t>
             </w:r>
           </w:p>
         </w:tc>
@@ -14582,10 +14592,7 @@
           </w:tcPr>
           <w:p>
             <w:r>
-              <w:t>21 статья по 6 категориям, 50 дополнительных материалов, внутренние ссылки, изображения, gif-анимации, видео, файлы</w:t>
-            </w:r>
-            <w:r>
-              <w:t>, инженерная лаборатория и практикум обучения</w:t>
+              <w:t>22 статьи по 6 категориям, 99 дополнительных материалов, внутренние ссылки, изображения, gif-анимации, видео, файлы, инженерная лаборатория и практикум обучения</w:t>
             </w:r>
           </w:p>
         </w:tc>
@@ -18794,10 +18801,7 @@
     </w:p>
     <w:p>
       <w:r>
-        <w:rPr>
-          <w:sz w:val="24"/>
-        </w:rPr>
-        <w:t>Практическая значимость проекта состоит в объединении действий, которые обычно выполняются в разрозненных системах: подбор компонента, построение схемы, расчет, симуляция, измерение, генерация BOM, экспертная проверка и подготовка заказа. В актуальной версии проекта зафиксированы 89 товаров, 43 РЭБ-компонента, 21 статья, 50 дополнительных материалов, 12 демонстрационных схем, 4 учебных маршрута, 13 уроков и 29 практических заданий.</w:t>
+        <w:t>Практическая значимость проекта состоит в объединении действий, которые обычно выполняются в разрозненных системах: подбор компонента, построение схемы, расчет, симуляция, измерение, генерация BOM, экспертная проверка и подготовка заказа. В актуальной версии проекта зафиксированы 364 товара, 227 РЭБ-компонентов, 22 статьи, 99 дополнительных материалов, 12 демонстрационных схем, 5 учебных маршрутов, 16 уроков и 38 практических заданий.</w:t>
       </w:r>
     </w:p>
     <w:p>
@@ -20175,6 +20179,18 @@
     <w:p>
       <w:r>
         <w:t>35. Абрамов, С. И. Сравнительный анализ архитектурных паттернов веб-приложений [Электронный ресурс] / С. И. Абрамов // Программная инженерия. — 2021. — № 4. — Режим доступа: https://swjournal.ru/article/2021-4-3 (дата обращения: 17.05.2024).</w:t>
+      </w:r>
+    </w:p>
+    <w:p>
+      <w:pPr/>
+      <w:r>
+        <w:t>36. Lithium ECAD. Официальный сайт [Электронный ресурс]. — Режим доступа: https://www.lecad.ru/ (дата обращения: 02.06.2026).</w:t>
+      </w:r>
+    </w:p>
+    <w:p>
+      <w:pPr/>
+      <w:r>
+        <w:t>37. Lithium ECAD. Синхронизация в Lithium ECAD [Электронный ресурс]. — Режим доступа: https://www.lecad.ru/sync-in-lithium-ecad/ (дата обращения: 02.06.2026).</w:t>
       </w:r>
     </w:p>
     <w:p>
@@ -21346,10 +21362,7 @@
           </w:tcPr>
           <w:p>
             <w:r>
-              <w:t>4 мар</w:t>
-            </w:r>
-            <w:r>
-              <w:t>шрута, 13 уроков, 29 заданий</w:t>
+              <w:t>5 маршрутов, 16 уроков, 38 заданий</w:t>
             </w:r>
           </w:p>
         </w:tc>
@@ -21405,43 +21418,8 @@
             <w:vAlign w:val="center"/>
           </w:tcPr>
           <w:p>
-            <w:pPr>
-              <w:rPr>
-                <w:lang w:val="en-US"/>
-              </w:rPr>
-            </w:pPr>
-            <w:r>
-              <w:rPr>
-                <w:lang w:val="en-US"/>
-              </w:rPr>
-              <w:t xml:space="preserve">89 </w:t>
-            </w:r>
-            <w:r>
-              <w:t>товаров</w:t>
-            </w:r>
-            <w:r>
-              <w:rPr>
-                <w:lang w:val="en-US"/>
-              </w:rPr>
-              <w:t xml:space="preserve">, 43 </w:t>
-            </w:r>
-            <w:r>
-              <w:t>РЭБ</w:t>
-            </w:r>
-            <w:r>
-              <w:rPr>
-                <w:lang w:val="en-US"/>
-              </w:rPr>
-              <w:t>-</w:t>
-            </w:r>
-            <w:r>
-              <w:t>компонента</w:t>
-            </w:r>
-            <w:r>
-              <w:rPr>
-                <w:lang w:val="en-US"/>
-              </w:rPr>
-              <w:t>, no-Wikimedia media-policy</w:t>
+            <w:r>
+              <w:t>364 товара, 227 РЭБ-компонентов, no-Wikimedia media-policy, 79 verified images</w:t>
             </w:r>
           </w:p>
         </w:tc>
@@ -21498,7 +21476,7 @@
           </w:tcPr>
           <w:p>
             <w:r>
-              <w:t>21 статья, 50 материалов, внутренние ссылки и связанные товары</w:t>
+              <w:t>22 статьи, 99 материалов, внутренние ссылки и связанные товары</w:t>
             </w:r>
           </w:p>
         </w:tc>
@@ -22333,16 +22311,8 @@
             <w:vAlign w:val="center"/>
           </w:tcPr>
           <w:p>
-            <w:pPr>
-              <w:spacing w:line="240" w:lineRule="auto"/>
-              <w:ind w:firstLine="0"/>
-              <w:jc w:val="left"/>
-            </w:pPr>
-            <w:r>
-              <w:rPr>
-                <w:sz w:val="18"/>
-              </w:rPr>
-              <w:t>Каталог расширен до 89 товаров, включая 43 РЭБ-компонента; у всех позиций заполнены фотографии</w:t>
+            <w:r>
+              <w:t>Каталог расширен до 364 товаров, включая 227 РЭБ-компонентов; медиа проходят no-Wikimedia policy и quality gate</w:t>
             </w:r>
           </w:p>
         </w:tc>
@@ -22651,7 +22621,7 @@
           </w:tcPr>
           <w:p>
             <w:r>
-              <w:t>Опубликованы 21 статья, 50 дополнительных материалов, 4 учебных маршрута, 13 уроков и 29 заданий</w:t>
+              <w:t>Опубликованы 22 статьи, 99 дополнительных материалов, 5 учебных маршрутов, 16 уроков и 38 заданий</w:t>
             </w:r>
           </w:p>
         </w:tc>

</xml_diff>